<commit_message>
docs: the cover names Team AIZEN, from the generator
Typed into the .docx it would survive exactly until the next
`python -m praman walkthrough` — which is a command the document itself tells
the reader to run. In the generator it is in the repository and cannot be
lost, and a test asserts it reaches the cover.

Co-Authored-By: Claude Opus 5 <noreply@anthropic.com>
</commit_message>
<xml_diff>
--- a/docs/Praman-Solution-Walkthrough.docx
+++ b/docs/Praman-Solution-Walkthrough.docx
@@ -2,6 +2,7 @@
 <file path=word/document.xml><?xml version="1.0" encoding="utf-8"?>
 <w:document xmlns:wpc="http://schemas.microsoft.com/office/word/2010/wordprocessingCanvas" xmlns:mo="http://schemas.microsoft.com/office/mac/office/2008/main" xmlns:mc="http://schemas.openxmlformats.org/markup-compatibility/2006" xmlns:mv="urn:schemas-microsoft-com:mac:vml" xmlns:o="urn:schemas-microsoft-com:office:office" xmlns:r="http://schemas.openxmlformats.org/officeDocument/2006/relationships" xmlns:m="http://schemas.openxmlformats.org/officeDocument/2006/math" xmlns:v="urn:schemas-microsoft-com:vml" xmlns:wp14="http://schemas.microsoft.com/office/word/2010/wordprocessingDrawing" xmlns:wp="http://schemas.openxmlformats.org/drawingml/2006/wordprocessingDrawing" xmlns:w10="urn:schemas-microsoft-com:office:word" xmlns:w="http://schemas.openxmlformats.org/wordprocessingml/2006/main" xmlns:w14="http://schemas.microsoft.com/office/word/2010/wordml" xmlns:wpg="http://schemas.microsoft.com/office/word/2010/wordprocessingGroup" xmlns:wpi="http://schemas.microsoft.com/office/word/2010/wordprocessingInk" xmlns:wne="http://schemas.microsoft.com/office/word/2006/wordml" xmlns:wps="http://schemas.microsoft.com/office/word/2010/wordprocessingShape" mc:Ignorable="w14 wp14">
   <w:body>
+    <w:p/>
     <w:p>
       <w:pPr>
         <w:pStyle w:val="Title"/>
@@ -20,10 +21,11 @@
       </w:pPr>
       <w:r>
         <w:rPr>
-          <w:b/>
-          <w:sz w:val="26"/>
+          <w:i/>
+          <w:color w:val="5B6675"/>
+          <w:sz w:val="20"/>
         </w:rPr>
-        <w:t>Breach and attack simulation for agentic payment mandates</w:t>
+        <w:t>प्रमाण  ·  proof; evidence; that which establishes a claim</w:t>
       </w:r>
     </w:p>
     <w:p>
@@ -31,11 +33,58 @@
         <w:jc w:val="center"/>
       </w:pPr>
       <w:r>
-        <w:t>Mastercard Innovation Challenge @ GFF 2026  ·  30 August 2026</w:t>
+        <w:rPr>
+          <w:b/>
+          <w:sz w:val="27"/>
+        </w:rPr>
+        <w:t>Breach and attack simulation for agentic payment mandates</w:t>
+      </w:r>
+    </w:p>
+    <w:p>
+      <w:pPr>
+        <w:spacing w:after="80"/>
+        <w:pBdr>
+          <w:bottom w:val="single" w:sz="8" w:space="1" w:color="C02B3E"/>
+        </w:pBdr>
+      </w:pPr>
+    </w:p>
+    <w:p>
+      <w:pPr>
+        <w:jc w:val="center"/>
+      </w:pPr>
+      <w:r>
+        <w:rPr>
+          <w:color w:val="5B6675"/>
+          <w:sz w:val="21"/>
+        </w:rPr>
+        <w:t>A product report  ·  Mastercard Innovation Challenge @ GFF 2026</w:t>
+      </w:r>
+    </w:p>
+    <w:p>
+      <w:pPr>
+        <w:jc w:val="center"/>
+      </w:pPr>
+      <w:r>
+        <w:rPr>
+          <w:b/>
+          <w:sz w:val="23"/>
+        </w:rPr>
+        <w:t>Team AIZEN</w:t>
+      </w:r>
+    </w:p>
+    <w:p>
+      <w:pPr>
+        <w:jc w:val="center"/>
+      </w:pPr>
+      <w:r>
+        <w:rPr>
+          <w:sz w:val="20"/>
+        </w:rPr>
+        <w:t>Prepared 30 August 2026</w:t>
         <w:br/>
-        <w:t>Repository: https://github.com/DnyaneshU/praman</w:t>
+        <w:t>Source code: https://github.com/DnyaneshU/praman</w:t>
         <w:br/>
-        <w:t>Live prototype: https://huggingface.co/spaces/DnyaneshU/praman</w:t>
+        <w:t>Working prototype: https://huggingface.co/spaces/DnyaneshU/praman</w:t>
       </w:r>
     </w:p>
     <w:p/>
@@ -44,7 +93,7 @@
         <w:pStyle w:val="IntenseQuote"/>
       </w:pPr>
       <w:r>
-        <w:t>An AI agent holds a signed mandate to spend your money. Praman attacks that mandate, measures what a control actually stops, then lets the attacker adapt and measures it again. Every figure in this document is read out of the committed results in the repository at build time; none of it is typed by hand.</w:t>
+        <w:t>An AI agent holds a signed mandate to spend your money. Praman attacks that mandate, measures what a control actually stops, then lets the attacker adapt and measures it again. Every figure in this report is read out of the committed results in the repository at build time. None of it is typed by hand.</w:t>
       </w:r>
     </w:p>
     <w:p>
@@ -52,22 +101,237 @@
         <w:pStyle w:val="Heading1"/>
       </w:pPr>
       <w:r>
-        <w:t>1. The problem</w:t>
+        <w:t>The position, in eight numbers</w:t>
       </w:r>
     </w:p>
     <w:p>
       <w:r>
-        <w:t>The industry is converging on cryptographically signed mandate chains — Google AP2, NPCI's Unified Agent Protocol, Mastercard Agent Pay — to let agents transact on a human's behalf. A user signs an Intent, a merchant issues a Cart, the agent signs a Payment.</w:t>
+        <w:rPr>
+          <w:color w:val="5B6675"/>
+          <w:sz w:val="20"/>
+        </w:rPr>
+        <w:t>Read from the committed campaigns at build time. The undefended row is the same harness with the control removed — one argument's difference — which is what makes the comparison honest rather than flattering.</w:t>
       </w:r>
     </w:p>
+    <w:tbl>
+      <w:tblPr>
+        <w:tblStyle w:val="LightList-Accent1"/>
+        <w:tblW w:type="auto" w:w="0"/>
+        <w:tblLook w:firstColumn="1" w:firstRow="1" w:lastColumn="0" w:lastRow="0" w:noHBand="0" w:noVBand="1" w:val="04A0"/>
+      </w:tblPr>
+      <w:tblGrid>
+        <w:gridCol w:w="4320"/>
+        <w:gridCol w:w="4320"/>
+      </w:tblGrid>
+      <w:tr>
+        <w:tc>
+          <w:tcPr>
+            <w:tcW w:type="dxa" w:w="4320"/>
+          </w:tcPr>
+          <w:p>
+            <w:r>
+              <w:rPr>
+                <w:b/>
+              </w:rPr>
+              <w:t>Measure</w:t>
+            </w:r>
+          </w:p>
+        </w:tc>
+        <w:tc>
+          <w:tcPr>
+            <w:tcW w:type="dxa" w:w="4320"/>
+          </w:tcPr>
+          <w:p>
+            <w:r>
+              <w:rPr>
+                <w:b/>
+              </w:rPr>
+              <w:t>Result</w:t>
+            </w:r>
+          </w:p>
+        </w:tc>
+      </w:tr>
+      <w:tr>
+        <w:tc>
+          <w:tcPr>
+            <w:tcW w:type="dxa" w:w="4320"/>
+          </w:tcPr>
+          <w:p>
+            <w:r>
+              <w:t>Attack vectors mapped</w:t>
+            </w:r>
+          </w:p>
+        </w:tc>
+        <w:tc>
+          <w:tcPr>
+            <w:tcW w:type="dxa" w:w="4320"/>
+          </w:tcPr>
+          <w:p>
+            <w:r>
+              <w:t>34 across 7 surfaces</w:t>
+            </w:r>
+          </w:p>
+        </w:tc>
+      </w:tr>
+      <w:tr>
+        <w:tc>
+          <w:tcPr>
+            <w:tcW w:type="dxa" w:w="4320"/>
+          </w:tcPr>
+          <w:p>
+            <w:r>
+              <w:t>Built, run and measured</w:t>
+            </w:r>
+          </w:p>
+        </w:tc>
+        <w:tc>
+          <w:tcPr>
+            <w:tcW w:type="dxa" w:w="4320"/>
+          </w:tcPr>
+          <w:p>
+            <w:r>
+              <w:t>6 of 34</w:t>
+            </w:r>
+          </w:p>
+        </w:tc>
+      </w:tr>
+      <w:tr>
+        <w:tc>
+          <w:tcPr>
+            <w:tcW w:type="dxa" w:w="4320"/>
+          </w:tcPr>
+          <w:p>
+            <w:r>
+              <w:t>Attack success with no control</w:t>
+            </w:r>
+          </w:p>
+        </w:tc>
+        <w:tc>
+          <w:tcPr>
+            <w:tcW w:type="dxa" w:w="4320"/>
+          </w:tcPr>
+          <w:p>
+            <w:r>
+              <w:t>100.0%</w:t>
+            </w:r>
+          </w:p>
+        </w:tc>
+      </w:tr>
+      <w:tr>
+        <w:tc>
+          <w:tcPr>
+            <w:tcW w:type="dxa" w:w="4320"/>
+          </w:tcPr>
+          <w:p>
+            <w:r>
+              <w:t>Attack success behind Tier 1</w:t>
+            </w:r>
+          </w:p>
+        </w:tc>
+        <w:tc>
+          <w:tcPr>
+            <w:tcW w:type="dxa" w:w="4320"/>
+          </w:tcPr>
+          <w:p>
+            <w:r>
+              <w:t>16.7%</w:t>
+            </w:r>
+          </w:p>
+        </w:tc>
+      </w:tr>
+      <w:tr>
+        <w:tc>
+          <w:tcPr>
+            <w:tcW w:type="dxa" w:w="4320"/>
+          </w:tcPr>
+          <w:p>
+            <w:r>
+              <w:t>Harm prevented</w:t>
+            </w:r>
+          </w:p>
+        </w:tc>
+        <w:tc>
+          <w:tcPr>
+            <w:tcW w:type="dxa" w:w="4320"/>
+          </w:tcPr>
+          <w:p>
+            <w:r>
+              <w:t>₹55,360.00 of the value at risk</w:t>
+            </w:r>
+          </w:p>
+        </w:tc>
+      </w:tr>
+      <w:tr>
+        <w:tc>
+          <w:tcPr>
+            <w:tcW w:type="dxa" w:w="4320"/>
+          </w:tcPr>
+          <w:p>
+            <w:r>
+              <w:t>Honest traffic still settling</w:t>
+            </w:r>
+          </w:p>
+        </w:tc>
+        <w:tc>
+          <w:tcPr>
+            <w:tcW w:type="dxa" w:w="4320"/>
+          </w:tcPr>
+          <w:p>
+            <w:r>
+              <w:t>100%</w:t>
+            </w:r>
+          </w:p>
+        </w:tc>
+      </w:tr>
+      <w:tr>
+        <w:tc>
+          <w:tcPr>
+            <w:tcW w:type="dxa" w:w="4320"/>
+          </w:tcPr>
+          <w:p>
+            <w:r>
+              <w:t>Attack success once the attacker adapts</w:t>
+            </w:r>
+          </w:p>
+        </w:tc>
+        <w:tc>
+          <w:tcPr>
+            <w:tcW w:type="dxa" w:w="4320"/>
+          </w:tcPr>
+          <w:p>
+            <w:r>
+              <w:t>+50.0 points</w:t>
+            </w:r>
+          </w:p>
+        </w:tc>
+      </w:tr>
+      <w:tr>
+        <w:tc>
+          <w:tcPr>
+            <w:tcW w:type="dxa" w:w="4320"/>
+          </w:tcPr>
+          <w:p>
+            <w:r>
+              <w:t>Cost of the control</w:t>
+            </w:r>
+          </w:p>
+        </w:tc>
+        <w:tc>
+          <w:tcPr>
+            <w:tcW w:type="dxa" w:w="4320"/>
+          </w:tcPr>
+          <w:p>
+            <w:r>
+              <w:t>3.5 ms per authorisation; no model, no network</w:t>
+            </w:r>
+          </w:p>
+        </w:tc>
+      </w:tr>
+    </w:tbl>
+    <w:p/>
     <w:p>
       <w:r>
-        <w:t>Every signature verifying does not mean the chain is sound. The attacks that matter forge nothing: they break a relationship between documents that nothing is checking. A cart that no longer serves its intent. A payment that leaves for someone who did not issue the cart. One authorisation redeemed three times at once. In each case every signature is valid and the money is gone.</w:t>
-      </w:r>
-    </w:p>
-    <w:p>
-      <w:r>
-        <w:t>Breach-and-attack simulation exists for networks and endpoints — Cymulate, AttackIQ, Picus. Nobody simulates attacks against a mandate. That is the gap Praman fills, and it is why the system is built as a red team and a blue team that feed each other rather than as a detector alone.</w:t>
+        <w:br w:type="page"/>
       </w:r>
     </w:p>
     <w:p>
@@ -75,12 +339,935 @@
         <w:pStyle w:val="Heading1"/>
       </w:pPr>
       <w:r>
-        <w:t>2. Identify — the attack surface, mapped</w:t>
+        <w:t>Part I  ·  Why we built this</w:t>
+      </w:r>
+    </w:p>
+    <w:p>
+      <w:pPr>
+        <w:pStyle w:val="Heading2"/>
+      </w:pPr>
+      <w:r>
+        <w:t>The market is about to hand agents a wallet</w:t>
       </w:r>
     </w:p>
     <w:p>
       <w:r>
-        <w:t>34 attack vectors across 7 surfaces of the payment stack. 6 are built, run, and measured against a control; the rest are mapped and explicitly marked as not built. That split is deliberate. Identification is research — what could go wrong, mapped as widely as we can see. Implementation is evidence — what we have actually run. Reporting them as one number is how an attack catalogue becomes a marketing document, and a test in the repository fails the build if the corpus and the code ever disagree.</w:t>
+        <w:t>The industry has converged on a single answer to the question of how an AI agent spends a human's money: cryptographically signed mandate chains. Google's AP2, NPCI's Unified Agent Protocol, Mastercard Agent Pay. A user signs an Intent, a merchant issues a Cart, the agent signs a Payment. Three documents, three signatures, one purchase.</w:t>
+      </w:r>
+    </w:p>
+    <w:p>
+      <w:r>
+        <w:t>This is a good design. It is also being deployed on the assumption that valid signatures mean a sound transaction, and those are not the same claim.</w:t>
+      </w:r>
+    </w:p>
+    <w:p>
+      <w:pPr>
+        <w:pStyle w:val="Heading2"/>
+      </w:pPr>
+      <w:r>
+        <w:t>The gap nobody is pricing</w:t>
+      </w:r>
+    </w:p>
+    <w:p>
+      <w:r>
+        <w:t>A signature proves who wrote a document. It proves nothing about the relationship between that document and the one before it. The attacks that matter forge nothing at all:</w:t>
+      </w:r>
+    </w:p>
+    <w:p>
+      <w:pPr>
+        <w:pStyle w:val="ListBullet"/>
+      </w:pPr>
+      <w:r>
+        <w:t>A cart that no longer serves the intent it claims to answer.</w:t>
+      </w:r>
+    </w:p>
+    <w:p>
+      <w:pPr>
+        <w:pStyle w:val="ListBullet"/>
+      </w:pPr>
+      <w:r>
+        <w:t>A payment that leaves for a beneficiary who did not issue the cart.</w:t>
+      </w:r>
+    </w:p>
+    <w:p>
+      <w:pPr>
+        <w:pStyle w:val="ListBullet"/>
+      </w:pPr>
+      <w:r>
+        <w:t>One authorisation redeemed three times, concurrently.</w:t>
+      </w:r>
+    </w:p>
+    <w:p>
+      <w:pPr>
+        <w:pStyle w:val="ListBullet"/>
+      </w:pPr>
+      <w:r>
+        <w:t>A line item inside the total charged but absent from the summary shown.</w:t>
+      </w:r>
+    </w:p>
+    <w:p>
+      <w:r>
+        <w:t>In each case every signature verifies, every document is authentic, and the money is gone. The vulnerability is not in any one mandate. It is in the joints between them — and a joint is exactly the thing a signature does not cover.</w:t>
+      </w:r>
+    </w:p>
+    <w:p>
+      <w:pPr>
+        <w:pStyle w:val="Heading2"/>
+      </w:pPr>
+      <w:r>
+        <w:t>Why nobody has measured it</w:t>
+      </w:r>
+    </w:p>
+    <w:p>
+      <w:r>
+        <w:t>Breach-and-attack simulation is a mature category for networks and endpoints: Cymulate, AttackIQ, Picus and others will attack your infrastructure on a schedule and report what your controls actually stopped. Nobody does this for a payment mandate. The tooling that exists either verifies signatures — which is not the failure mode — or scores transactions after settlement, which is a chargeback, not a defense.</w:t>
+      </w:r>
+    </w:p>
+    <w:p>
+      <w:r>
+        <w:rPr>
+          <w:b/>
+        </w:rPr>
+        <w:t>So the question that decides whether any of this is safe — how much money does this control actually save, against an attacker who is trying — has no instrument to answer it. Praman is that instrument.</w:t>
+      </w:r>
+    </w:p>
+    <w:p>
+      <w:pPr>
+        <w:pStyle w:val="Heading1"/>
+      </w:pPr>
+      <w:r>
+        <w:t>Part II  ·  What Praman is, and the philosophy behind it</w:t>
+      </w:r>
+    </w:p>
+    <w:p>
+      <w:r>
+        <w:t>Praman is a measuring instrument, not a detector. It is four pieces that check each other:</w:t>
+      </w:r>
+    </w:p>
+    <w:tbl>
+      <w:tblPr>
+        <w:tblStyle w:val="LightGrid-Accent1"/>
+        <w:tblW w:type="auto" w:w="0"/>
+        <w:tblLook w:firstColumn="1" w:firstRow="1" w:lastColumn="0" w:lastRow="0" w:noHBand="0" w:noVBand="1" w:val="04A0"/>
+      </w:tblPr>
+      <w:tblGrid>
+        <w:gridCol w:w="2880"/>
+        <w:gridCol w:w="2880"/>
+        <w:gridCol w:w="2880"/>
+      </w:tblGrid>
+      <w:tr>
+        <w:tc>
+          <w:tcPr>
+            <w:tcW w:type="dxa" w:w="2880"/>
+          </w:tcPr>
+          <w:p>
+            <w:r>
+              <w:rPr>
+                <w:b/>
+              </w:rPr>
+              <w:t>Component</w:t>
+            </w:r>
+          </w:p>
+        </w:tc>
+        <w:tc>
+          <w:tcPr>
+            <w:tcW w:type="dxa" w:w="2880"/>
+          </w:tcPr>
+          <w:p>
+            <w:r>
+              <w:rPr>
+                <w:b/>
+              </w:rPr>
+              <w:t>What it is</w:t>
+            </w:r>
+          </w:p>
+        </w:tc>
+        <w:tc>
+          <w:tcPr>
+            <w:tcW w:type="dxa" w:w="2880"/>
+          </w:tcPr>
+          <w:p>
+            <w:r>
+              <w:rPr>
+                <w:b/>
+              </w:rPr>
+              <w:t>What it settles</w:t>
+            </w:r>
+          </w:p>
+        </w:tc>
+      </w:tr>
+      <w:tr>
+        <w:tc>
+          <w:tcPr>
+            <w:tcW w:type="dxa" w:w="2880"/>
+          </w:tcPr>
+          <w:p>
+            <w:r>
+              <w:t>The range</w:t>
+            </w:r>
+          </w:p>
+        </w:tc>
+        <w:tc>
+          <w:tcPr>
+            <w:tcW w:type="dxa" w:w="2880"/>
+          </w:tcPr>
+          <w:p>
+            <w:r>
+              <w:t>A simulated payment rail — signed mandates, a merchant population, a double-entry ledger</w:t>
+            </w:r>
+          </w:p>
+        </w:tc>
+        <w:tc>
+          <w:tcPr>
+            <w:tcW w:type="dxa" w:w="2880"/>
+          </w:tcPr>
+          <w:p>
+            <w:r>
+              <w:t>Where an attack's money actually ends up</w:t>
+            </w:r>
+          </w:p>
+        </w:tc>
+      </w:tr>
+      <w:tr>
+        <w:tc>
+          <w:tcPr>
+            <w:tcW w:type="dxa" w:w="2880"/>
+          </w:tcPr>
+          <w:p>
+            <w:r>
+              <w:t>Red</w:t>
+            </w:r>
+          </w:p>
+        </w:tc>
+        <w:tc>
+          <w:tcPr>
+            <w:tcW w:type="dxa" w:w="2880"/>
+          </w:tcPr>
+          <w:p>
+            <w:r>
+              <w:t>An attack corpus, plus a defense-aware mutation search</w:t>
+            </w:r>
+          </w:p>
+        </w:tc>
+        <w:tc>
+          <w:tcPr>
+            <w:tcW w:type="dxa" w:w="2880"/>
+          </w:tcPr>
+          <w:p>
+            <w:r>
+              <w:t>What an attacker can do, including things nobody wrote down</w:t>
+            </w:r>
+          </w:p>
+        </w:tc>
+      </w:tr>
+      <w:tr>
+        <w:tc>
+          <w:tcPr>
+            <w:tcW w:type="dxa" w:w="2880"/>
+          </w:tcPr>
+          <w:p>
+            <w:r>
+              <w:t>Blue</w:t>
+            </w:r>
+          </w:p>
+        </w:tc>
+        <w:tc>
+          <w:tcPr>
+            <w:tcW w:type="dxa" w:w="2880"/>
+          </w:tcPr>
+          <w:p>
+            <w:r>
+              <w:t>A three-tier, out-of-band reference monitor</w:t>
+            </w:r>
+          </w:p>
+        </w:tc>
+        <w:tc>
+          <w:tcPr>
+            <w:tcW w:type="dxa" w:w="2880"/>
+          </w:tcPr>
+          <w:p>
+            <w:r>
+              <w:t>What a control stops, and what it costs to run</w:t>
+            </w:r>
+          </w:p>
+        </w:tc>
+      </w:tr>
+      <w:tr>
+        <w:tc>
+          <w:tcPr>
+            <w:tcW w:type="dxa" w:w="2880"/>
+          </w:tcPr>
+          <w:p>
+            <w:r>
+              <w:t>The arena</w:t>
+            </w:r>
+          </w:p>
+        </w:tc>
+        <w:tc>
+          <w:tcPr>
+            <w:tcW w:type="dxa" w:w="2880"/>
+          </w:tcPr>
+          <w:p>
+            <w:r>
+              <w:t>A browser view that replays any committed campaign</w:t>
+            </w:r>
+          </w:p>
+        </w:tc>
+        <w:tc>
+          <w:tcPr>
+            <w:tcW w:type="dxa" w:w="2880"/>
+          </w:tcPr>
+          <w:p>
+            <w:r>
+              <w:t>That the numbers are inspectable rather than asserted</w:t>
+            </w:r>
+          </w:p>
+        </w:tc>
+      </w:tr>
+    </w:tbl>
+    <w:p/>
+    <w:p>
+      <w:r>
+        <w:rPr>
+          <w:b/>
+        </w:rPr>
+        <w:t>The ledger is the arbiter, and that is the most important decision in the system. An attack succeeded if and only if the balance on an attacker-controlled account went up. No model, scorer or heuristic gets a vote. A harness whose detector decides whether the detector worked is grading its own homework.</w:t>
+      </w:r>
+    </w:p>
+    <w:p>
+      <w:pPr>
+        <w:pStyle w:val="Heading2"/>
+      </w:pPr>
+      <w:r>
+        <w:t>The decisions, and what we rejected</w:t>
+      </w:r>
+    </w:p>
+    <w:p>
+      <w:r>
+        <w:rPr>
+          <w:color w:val="5B6675"/>
+          <w:sz w:val="20"/>
+        </w:rPr>
+        <w:t>A product is also the set of things it refused to do. These are the choices that shaped Praman, each with the alternative we turned down and the reason.</w:t>
+      </w:r>
+    </w:p>
+    <w:tbl>
+      <w:tblPr>
+        <w:tblStyle w:val="LightGrid-Accent1"/>
+        <w:tblW w:type="auto" w:w="0"/>
+        <w:tblLook w:firstColumn="1" w:firstRow="1" w:lastColumn="0" w:lastRow="0" w:noHBand="0" w:noVBand="1" w:val="04A0"/>
+      </w:tblPr>
+      <w:tblGrid>
+        <w:gridCol w:w="2880"/>
+        <w:gridCol w:w="2880"/>
+        <w:gridCol w:w="2880"/>
+      </w:tblGrid>
+      <w:tr>
+        <w:tc>
+          <w:tcPr>
+            <w:tcW w:type="dxa" w:w="2880"/>
+          </w:tcPr>
+          <w:p>
+            <w:r>
+              <w:rPr>
+                <w:b/>
+              </w:rPr>
+              <w:t>Decision</w:t>
+            </w:r>
+          </w:p>
+        </w:tc>
+        <w:tc>
+          <w:tcPr>
+            <w:tcW w:type="dxa" w:w="2880"/>
+          </w:tcPr>
+          <w:p>
+            <w:r>
+              <w:rPr>
+                <w:b/>
+              </w:rPr>
+              <w:t>What we chose</w:t>
+            </w:r>
+          </w:p>
+        </w:tc>
+        <w:tc>
+          <w:tcPr>
+            <w:tcW w:type="dxa" w:w="2880"/>
+          </w:tcPr>
+          <w:p>
+            <w:r>
+              <w:rPr>
+                <w:b/>
+              </w:rPr>
+              <w:t>What we rejected, and why</w:t>
+            </w:r>
+          </w:p>
+        </w:tc>
+      </w:tr>
+      <w:tr>
+        <w:tc>
+          <w:tcPr>
+            <w:tcW w:type="dxa" w:w="2880"/>
+          </w:tcPr>
+          <w:p>
+            <w:r>
+              <w:t>What counts as success</w:t>
+            </w:r>
+          </w:p>
+        </w:tc>
+        <w:tc>
+          <w:tcPr>
+            <w:tcW w:type="dxa" w:w="2880"/>
+          </w:tcPr>
+          <w:p>
+            <w:r>
+              <w:t>A balance delta on the attacker's ledger account</w:t>
+            </w:r>
+          </w:p>
+        </w:tc>
+        <w:tc>
+          <w:tcPr>
+            <w:tcW w:type="dxa" w:w="2880"/>
+          </w:tcPr>
+          <w:p>
+            <w:r>
+              <w:t>The control's own verdict — the harness would be grading itself</w:t>
+            </w:r>
+          </w:p>
+        </w:tc>
+      </w:tr>
+      <w:tr>
+        <w:tc>
+          <w:tcPr>
+            <w:tcW w:type="dxa" w:w="2880"/>
+          </w:tcPr>
+          <w:p>
+            <w:r>
+              <w:t>Money</w:t>
+            </w:r>
+          </w:p>
+        </w:tc>
+        <w:tc>
+          <w:tcPr>
+            <w:tcW w:type="dxa" w:w="2880"/>
+          </w:tcPr>
+          <w:p>
+            <w:r>
+              <w:t>Decimal paise; floats rejected, not coerced</w:t>
+            </w:r>
+          </w:p>
+        </w:tc>
+        <w:tc>
+          <w:tcPr>
+            <w:tcW w:type="dxa" w:w="2880"/>
+          </w:tcPr>
+          <w:p>
+            <w:r>
+              <w:t>Silent coercion — a rounding error in a fraud harness is a number nobody can trust</w:t>
+            </w:r>
+          </w:p>
+        </w:tc>
+      </w:tr>
+      <w:tr>
+        <w:tc>
+          <w:tcPr>
+            <w:tcW w:type="dxa" w:w="2880"/>
+          </w:tcPr>
+          <w:p>
+            <w:r>
+              <w:t>How attacks sign</w:t>
+            </w:r>
+          </w:p>
+        </w:tc>
+        <w:tc>
+          <w:tcPr>
+            <w:tcW w:type="dxa" w:w="2880"/>
+          </w:tcPr>
+          <w:p>
+            <w:r>
+              <w:t>Only with keys the attacker legitimately holds</w:t>
+            </w:r>
+          </w:p>
+        </w:tc>
+        <w:tc>
+          <w:tcPr>
+            <w:tcW w:type="dxa" w:w="2880"/>
+          </w:tcPr>
+          <w:p>
+            <w:r>
+              <w:t>Forging the user's key — that tests our signature check, which already works</w:t>
+            </w:r>
+          </w:p>
+        </w:tc>
+      </w:tr>
+      <w:tr>
+        <w:tc>
+          <w:tcPr>
+            <w:tcW w:type="dxa" w:w="2880"/>
+          </w:tcPr>
+          <w:p>
+            <w:r>
+              <w:t>Order of the tiers</w:t>
+            </w:r>
+          </w:p>
+        </w:tc>
+        <w:tc>
+          <w:tcPr>
+            <w:tcW w:type="dxa" w:w="2880"/>
+          </w:tcPr>
+          <w:p>
+            <w:r>
+              <w:t>Deterministic arithmetic first, model second</w:t>
+            </w:r>
+          </w:p>
+        </w:tc>
+        <w:tc>
+          <w:tcPr>
+            <w:tcW w:type="dxa" w:w="2880"/>
+          </w:tcPr>
+          <w:p>
+            <w:r>
+              <w:t>Model first — a model that fails is unexplainable; a rule that fails names itself</w:t>
+            </w:r>
+          </w:p>
+        </w:tc>
+      </w:tr>
+      <w:tr>
+        <w:tc>
+          <w:tcPr>
+            <w:tcW w:type="dxa" w:w="2880"/>
+          </w:tcPr>
+          <w:p>
+            <w:r>
+              <w:t>Tier 3's authority</w:t>
+            </w:r>
+          </w:p>
+        </w:tc>
+        <w:tc>
+          <w:tcPr>
+            <w:tcW w:type="dxa" w:w="2880"/>
+          </w:tcPr>
+          <w:p>
+            <w:r>
+              <w:t>It escalates for review; it never blocks</w:t>
+            </w:r>
+          </w:p>
+        </w:tc>
+        <w:tc>
+          <w:tcPr>
+            <w:tcW w:type="dxa" w:w="2880"/>
+          </w:tcPr>
+          <w:p>
+            <w:r>
+              <w:t>Letting semantics refuse a payment — its first version escalated everything, at a 0% honest pass rate</w:t>
+            </w:r>
+          </w:p>
+        </w:tc>
+      </w:tr>
+      <w:tr>
+        <w:tc>
+          <w:tcPr>
+            <w:tcW w:type="dxa" w:w="2880"/>
+          </w:tcPr>
+          <w:p>
+            <w:r>
+              <w:t>The headline metric</w:t>
+            </w:r>
+          </w:p>
+        </w:tc>
+        <w:tc>
+          <w:tcPr>
+            <w:tcW w:type="dxa" w:w="2880"/>
+          </w:tcPr>
+          <w:p>
+            <w:r>
+              <w:t>The adaptive delta — how much better an attacker gets</w:t>
+            </w:r>
+          </w:p>
+        </w:tc>
+        <w:tc>
+          <w:tcPr>
+            <w:tcW w:type="dxa" w:w="2880"/>
+          </w:tcPr>
+          <w:p>
+            <w:r>
+              <w:t>Static attack success — every comparable tool reports round 0 and stops</w:t>
+            </w:r>
+          </w:p>
+        </w:tc>
+      </w:tr>
+      <w:tr>
+        <w:tc>
+          <w:tcPr>
+            <w:tcW w:type="dxa" w:w="2880"/>
+          </w:tcPr>
+          <w:p>
+            <w:r>
+              <w:t>Map versus build</w:t>
+            </w:r>
+          </w:p>
+        </w:tc>
+        <w:tc>
+          <w:tcPr>
+            <w:tcW w:type="dxa" w:w="2880"/>
+          </w:tcPr>
+          <w:p>
+            <w:r>
+              <w:t>Counted and reported separately, always</w:t>
+            </w:r>
+          </w:p>
+        </w:tc>
+        <w:tc>
+          <w:tcPr>
+            <w:tcW w:type="dxa" w:w="2880"/>
+          </w:tcPr>
+          <w:p>
+            <w:r>
+              <w:t>One combined figure — that is how an attack catalogue becomes a marketing document</w:t>
+            </w:r>
+          </w:p>
+        </w:tc>
+      </w:tr>
+      <w:tr>
+        <w:tc>
+          <w:tcPr>
+            <w:tcW w:type="dxa" w:w="2880"/>
+          </w:tcPr>
+          <w:p>
+            <w:r>
+              <w:t>Deployment</w:t>
+            </w:r>
+          </w:p>
+        </w:tc>
+        <w:tc>
+          <w:tcPr>
+            <w:tcW w:type="dxa" w:w="2880"/>
+          </w:tcPr>
+          <w:p>
+            <w:r>
+              <w:t>Static files: no server, no credential, no database</w:t>
+            </w:r>
+          </w:p>
+        </w:tc>
+        <w:tc>
+          <w:tcPr>
+            <w:tcW w:type="dxa" w:w="2880"/>
+          </w:tcPr>
+          <w:p>
+            <w:r>
+              <w:t>A container — free tiers sleep, and a judge's first visit pays the cold start</w:t>
+            </w:r>
+          </w:p>
+        </w:tc>
+      </w:tr>
+    </w:tbl>
+    <w:p/>
+    <w:p>
+      <w:pPr>
+        <w:pStyle w:val="Heading2"/>
+      </w:pPr>
+      <w:r>
+        <w:t>What would change our mind</w:t>
+      </w:r>
+    </w:p>
+    <w:p>
+      <w:r>
+        <w:t>A claim that cannot fail is not a finding. Three results would falsify the thesis of this project, and the harness is built so each of them would show:</w:t>
+      </w:r>
+    </w:p>
+    <w:p>
+      <w:pPr>
+        <w:pStyle w:val="ListBullet"/>
+      </w:pPr>
+      <w:r>
+        <w:t>If the adaptive delta were zero — an attacker allowed to read refusals and retry gets no further than the documented corpus — then Praman is a regression suite and the interesting claim is gone. The adaptive command exits non-zero if that happens.</w:t>
+      </w:r>
+    </w:p>
+    <w:p>
+      <w:pPr>
+        <w:pStyle w:val="ListBullet"/>
+      </w:pPr>
+      <w:r>
+        <w:t>If attack success against an undefended range were below 100%, the baseline would not be a baseline, and every prevention figure measured against it would be inflated. The campaign runner exits non-zero if that happens.</w:t>
+      </w:r>
+    </w:p>
+    <w:p>
+      <w:pPr>
+        <w:pStyle w:val="ListBullet"/>
+      </w:pPr>
+      <w:r>
+        <w:t>If honest traffic ever failed to settle, the control would be unshippable whatever its recall — so the benign pass rate is printed beside every headline number rather than in an appendix.</w:t>
+      </w:r>
+    </w:p>
+    <w:p>
+      <w:r>
+        <w:br w:type="page"/>
+      </w:r>
+    </w:p>
+    <w:p>
+      <w:pPr>
+        <w:pStyle w:val="Heading1"/>
+      </w:pPr>
+      <w:r>
+        <w:t>Part III  ·  What it does</w:t>
+      </w:r>
+    </w:p>
+    <w:p>
+      <w:r>
+        <w:t>Five capabilities, and one file format anybody can extend. This is the whole product surface.</w:t>
+      </w:r>
+    </w:p>
+    <w:tbl>
+      <w:tblPr>
+        <w:tblStyle w:val="LightGrid-Accent1"/>
+        <w:tblW w:type="auto" w:w="0"/>
+        <w:tblLook w:firstColumn="1" w:firstRow="1" w:lastColumn="0" w:lastRow="0" w:noHBand="0" w:noVBand="1" w:val="04A0"/>
+      </w:tblPr>
+      <w:tblGrid>
+        <w:gridCol w:w="2880"/>
+        <w:gridCol w:w="2880"/>
+        <w:gridCol w:w="2880"/>
+      </w:tblGrid>
+      <w:tr>
+        <w:tc>
+          <w:tcPr>
+            <w:tcW w:type="dxa" w:w="2880"/>
+          </w:tcPr>
+          <w:p>
+            <w:r>
+              <w:rPr>
+                <w:b/>
+              </w:rPr>
+              <w:t>Capability</w:t>
+            </w:r>
+          </w:p>
+        </w:tc>
+        <w:tc>
+          <w:tcPr>
+            <w:tcW w:type="dxa" w:w="2880"/>
+          </w:tcPr>
+          <w:p>
+            <w:r>
+              <w:rPr>
+                <w:b/>
+              </w:rPr>
+              <w:t>Command</w:t>
+            </w:r>
+          </w:p>
+        </w:tc>
+        <w:tc>
+          <w:tcPr>
+            <w:tcW w:type="dxa" w:w="2880"/>
+          </w:tcPr>
+          <w:p>
+            <w:r>
+              <w:rPr>
+                <w:b/>
+              </w:rPr>
+              <w:t>What comes back</w:t>
+            </w:r>
+          </w:p>
+        </w:tc>
+      </w:tr>
+      <w:tr>
+        <w:tc>
+          <w:tcPr>
+            <w:tcW w:type="dxa" w:w="2880"/>
+          </w:tcPr>
+          <w:p>
+            <w:r>
+              <w:t>Map the attack surface</w:t>
+            </w:r>
+          </w:p>
+        </w:tc>
+        <w:tc>
+          <w:tcPr>
+            <w:tcW w:type="dxa" w:w="2880"/>
+          </w:tcPr>
+          <w:p>
+            <w:r>
+              <w:t>python -m praman corpus</w:t>
+            </w:r>
+          </w:p>
+        </w:tc>
+        <w:tc>
+          <w:tcPr>
+            <w:tcW w:type="dxa" w:w="2880"/>
+          </w:tcPr>
+          <w:p>
+            <w:r>
+              <w:t>34 vectors across 7 surfaces, with the 6 that are built marked as built</w:t>
+            </w:r>
+          </w:p>
+        </w:tc>
+      </w:tr>
+      <w:tr>
+        <w:tc>
+          <w:tcPr>
+            <w:tcW w:type="dxa" w:w="2880"/>
+          </w:tcPr>
+          <w:p>
+            <w:r>
+              <w:t>Measure a control</w:t>
+            </w:r>
+          </w:p>
+        </w:tc>
+        <w:tc>
+          <w:tcPr>
+            <w:tcW w:type="dxa" w:w="2880"/>
+          </w:tcPr>
+          <w:p>
+            <w:r>
+              <w:t>python -m praman matrix</w:t>
+            </w:r>
+          </w:p>
+        </w:tc>
+        <w:tc>
+          <w:tcPr>
+            <w:tcW w:type="dxa" w:w="2880"/>
+          </w:tcPr>
+          <w:p>
+            <w:r>
+              <w:t>Every rail crossed with every control, baseline beside defended</w:t>
+            </w:r>
+          </w:p>
+        </w:tc>
+      </w:tr>
+      <w:tr>
+        <w:tc>
+          <w:tcPr>
+            <w:tcW w:type="dxa" w:w="2880"/>
+          </w:tcPr>
+          <w:p>
+            <w:r>
+              <w:t>Score it as a detector</w:t>
+            </w:r>
+          </w:p>
+        </w:tc>
+        <w:tc>
+          <w:tcPr>
+            <w:tcW w:type="dxa" w:w="2880"/>
+          </w:tcPr>
+          <w:p>
+            <w:r>
+              <w:t>python -m praman detect</w:t>
+            </w:r>
+          </w:p>
+        </w:tc>
+        <w:tc>
+          <w:tcPr>
+            <w:tcW w:type="dxa" w:w="2880"/>
+          </w:tcPr>
+          <w:p>
+            <w:r>
+              <w:t>Precision, recall, F1, false-positive rate and AUC, per campaign</w:t>
+            </w:r>
+          </w:p>
+        </w:tc>
+      </w:tr>
+      <w:tr>
+        <w:tc>
+          <w:tcPr>
+            <w:tcW w:type="dxa" w:w="2880"/>
+          </w:tcPr>
+          <w:p>
+            <w:r>
+              <w:t>Let the attacker adapt</w:t>
+            </w:r>
+          </w:p>
+        </w:tc>
+        <w:tc>
+          <w:tcPr>
+            <w:tcW w:type="dxa" w:w="2880"/>
+          </w:tcPr>
+          <w:p>
+            <w:r>
+              <w:t>python -m praman adapt</w:t>
+            </w:r>
+          </w:p>
+        </w:tc>
+        <w:tc>
+          <w:tcPr>
+            <w:tcW w:type="dxa" w:w="2880"/>
+          </w:tcPr>
+          <w:p>
+            <w:r>
+              <w:t>The static-versus-adaptive gap, and the strategy that broke each rule</w:t>
+            </w:r>
+          </w:p>
+        </w:tc>
+      </w:tr>
+      <w:tr>
+        <w:tc>
+          <w:tcPr>
+            <w:tcW w:type="dxa" w:w="2880"/>
+          </w:tcPr>
+          <w:p>
+            <w:r>
+              <w:t>Add your own test case</w:t>
+            </w:r>
+          </w:p>
+        </w:tc>
+        <w:tc>
+          <w:tcPr>
+            <w:tcW w:type="dxa" w:w="2880"/>
+          </w:tcPr>
+          <w:p>
+            <w:r>
+              <w:t>python -m praman run &lt;scenario.yaml&gt;</w:t>
+            </w:r>
+          </w:p>
+        </w:tc>
+        <w:tc>
+          <w:tcPr>
+            <w:tcW w:type="dxa" w:w="2880"/>
+          </w:tcPr>
+          <w:p>
+            <w:r>
+              <w:t>A new campaign in the arena — no code change, no redeploy</w:t>
+            </w:r>
+          </w:p>
+        </w:tc>
+      </w:tr>
+    </w:tbl>
+    <w:p/>
+    <w:p>
+      <w:r>
+        <w:t>The last row is what makes this a product rather than a demo. A teammate who wants to test a case we never thought of writes one YAML file — rail, control, attacks, an optional merchant overlay — and optionally one Python file for a genuinely new attack. It is validated, run, and appears in the arena beside the shipped campaigns, filed under its own heading so it is never mistaken for one of ours.</w:t>
+      </w:r>
+    </w:p>
+    <w:p>
+      <w:r>
+        <w:br w:type="page"/>
+      </w:r>
+    </w:p>
+    <w:p>
+      <w:pPr>
+        <w:pStyle w:val="Heading1"/>
+      </w:pPr>
+      <w:r>
+        <w:t>Part IV  ·  The engineering</w:t>
+      </w:r>
+    </w:p>
+    <w:p>
+      <w:r>
+        <w:rPr>
+          <w:color w:val="5B6675"/>
+          <w:sz w:val="20"/>
+        </w:rPr>
+        <w:t>Four books: what we identify, how we generate it, what defends against it, and what it would take to run in production.</w:t>
+      </w:r>
+    </w:p>
+    <w:p>
+      <w:pPr>
+        <w:pStyle w:val="Heading2"/>
+      </w:pPr>
+      <w:r>
+        <w:t>Book One  ·  Identify — the attack surface, mapped</w:t>
+      </w:r>
+    </w:p>
+    <w:p>
+      <w:r>
+        <w:t>34 attack vectors across 7 surfaces of the payment stack. 6 are built, run and measured against a control; the rest are mapped and explicitly marked as not built. That split is deliberate. Identification is research — what could go wrong, mapped as widely as we can see. Implementation is evidence — what we have actually run. Reporting them as one number is how an attack catalogue becomes a marketing document, and a test fails the build if the corpus and the code ever disagree.</w:t>
       </w:r>
     </w:p>
     <w:tbl>
@@ -452,17 +1639,18 @@
     </w:p>
     <w:p>
       <w:pPr>
-        <w:pStyle w:val="Heading2"/>
+        <w:pStyle w:val="Heading3"/>
       </w:pPr>
       <w:r>
         <w:t>The full map</w:t>
       </w:r>
     </w:p>
     <w:p>
-      <w:pPr>
-        <w:pStyle w:val="Heading3"/>
-      </w:pPr>
       <w:r>
+        <w:rPr>
+          <w:b/>
+          <w:sz w:val="21"/>
+        </w:rPr>
         <w:t>mandate-chain — The signed Intent -&gt; Cart -&gt; Payment protocol itself</w:t>
       </w:r>
     </w:p>
@@ -965,10 +2153,11 @@
     </w:tbl>
     <w:p/>
     <w:p>
-      <w:pPr>
-        <w:pStyle w:val="Heading3"/>
-      </w:pPr>
       <w:r>
+        <w:rPr>
+          <w:b/>
+          <w:sz w:val="21"/>
+        </w:rPr>
         <w:t>upi-rail — India's rails: UPI, Autopay, AePS, BBPS, e-RUPI</w:t>
       </w:r>
     </w:p>
@@ -1419,10 +2608,11 @@
     </w:tbl>
     <w:p/>
     <w:p>
-      <w:pPr>
-        <w:pStyle w:val="Heading3"/>
-      </w:pPr>
       <w:r>
+        <w:rPr>
+          <w:b/>
+          <w:sz w:val="21"/>
+        </w:rPr>
         <w:t>card-rail — Tokenisation, 3DS, merchant-initiated transactions</w:t>
       </w:r>
     </w:p>
@@ -1665,10 +2855,11 @@
     </w:tbl>
     <w:p/>
     <w:p>
-      <w:pPr>
-        <w:pStyle w:val="Heading3"/>
-      </w:pPr>
       <w:r>
+        <w:rPr>
+          <w:b/>
+          <w:sz w:val="21"/>
+        </w:rPr>
         <w:t>agent-protocol — Agent-to-agent trust, delegation, tool supply chain</w:t>
       </w:r>
     </w:p>
@@ -1963,10 +3154,11 @@
     </w:tbl>
     <w:p/>
     <w:p>
-      <w:pPr>
-        <w:pStyle w:val="Heading3"/>
-      </w:pPr>
       <w:r>
+        <w:rPr>
+          <w:b/>
+          <w:sz w:val="21"/>
+        </w:rPr>
         <w:t>agent-judgement — Subverting what the model decides to do</w:t>
       </w:r>
     </w:p>
@@ -2365,10 +3557,11 @@
     </w:tbl>
     <w:p/>
     <w:p>
-      <w:pPr>
-        <w:pStyle w:val="Heading3"/>
-      </w:pPr>
       <w:r>
+        <w:rPr>
+          <w:b/>
+          <w:sz w:val="21"/>
+        </w:rPr>
         <w:t>social — GenAI social engineering against the human</w:t>
       </w:r>
     </w:p>
@@ -2663,10 +3856,11 @@
     </w:tbl>
     <w:p/>
     <w:p>
-      <w:pPr>
-        <w:pStyle w:val="Heading3"/>
-      </w:pPr>
       <w:r>
+        <w:rPr>
+          <w:b/>
+          <w:sz w:val="21"/>
+        </w:rPr>
         <w:t>laundering — Moving the proceeds once the payment succeeds</w:t>
       </w:r>
     </w:p>
@@ -2858,20 +4052,23 @@
     <w:p/>
     <w:p>
       <w:r>
+        <w:rPr>
+          <w:b/>
+        </w:rPr>
         <w:t>Three independent entries — S-05 (scope escalation), I-22 (low-value offline bypass) and D-33 (structuring under review thresholds) — fail for want of the same missing control: cumulative accounting across mandates against a delegated cap. Three attack surfaces converging on one gap is the clearest signal in the map for what to build next, and finding that is what a map is for.</w:t>
       </w:r>
     </w:p>
     <w:p>
       <w:pPr>
-        <w:pStyle w:val="Heading1"/>
+        <w:pStyle w:val="Heading2"/>
       </w:pPr>
       <w:r>
-        <w:t>3. Generate — the range, and the search</w:t>
+        <w:t>Book Two  ·  Generate — the range, and the search</w:t>
       </w:r>
     </w:p>
     <w:p>
       <w:pPr>
-        <w:pStyle w:val="Heading2"/>
+        <w:pStyle w:val="Heading3"/>
       </w:pPr>
       <w:r>
         <w:t>Fidelity</w:t>
@@ -2882,7 +4079,7 @@
         <w:pStyle w:val="ListBullet"/>
       </w:pPr>
       <w:r>
-        <w:t>Mandates are signed with real ECDSA P-256 over a canonical serialisation, not mocked. An attack re-signs only with keys the attacker legitimately holds — its own merchant, or one whose key it has compromised — never the user's. An attack that forged the user's signature would be testing our signature check, which already works.</w:t>
+        <w:t>Mandates are signed with real ECDSA P-256 over a canonical serialisation, not mocked. An attack re-signs only with keys the attacker legitimately holds — its own merchant, or one whose key it has compromised — never the user's.</w:t>
       </w:r>
     </w:p>
     <w:p>
@@ -2898,7 +4095,7 @@
         <w:pStyle w:val="ListBullet"/>
       </w:pPr>
       <w:r>
-        <w:t>The ledger is SQLite with real transactions, and it refuses unmediated settlement. Harm is a balance delta on an account the attacker controls — no model, scorer or heuristic decides whether an attack succeeded.</w:t>
+        <w:t>The ledger is SQLite with real transactions, and it refuses unmediated settlement. Harm is a balance delta on an account the attacker controls.</w:t>
       </w:r>
     </w:p>
     <w:p>
@@ -2922,12 +4119,12 @@
         <w:pStyle w:val="ListBullet"/>
       </w:pPr>
       <w:r>
-        <w:t>Everything is seeded. The same seed reproduces every result field on any machine; timestamps and latencies are measurements of the run rather than results from it and are excluded by name. CI re-derives the committed numbers on every push.</w:t>
+        <w:t>Everything is seeded. The same seed reproduces every result field on any machine; timestamps and latencies are measurements of the run rather than results from it, and are excluded by name. CI re-derives the committed numbers on every push.</w:t>
       </w:r>
     </w:p>
     <w:p>
       <w:pPr>
-        <w:pStyle w:val="Heading2"/>
+        <w:pStyle w:val="Heading3"/>
       </w:pPr>
       <w:r>
         <w:t>The search — attacks nobody wrote</w:t>
@@ -2945,10 +4142,10 @@
     </w:p>
     <w:p>
       <w:pPr>
-        <w:pStyle w:val="Heading1"/>
+        <w:pStyle w:val="Heading2"/>
       </w:pPr>
       <w:r>
-        <w:t>4. Defend — three tiers, and what they actually catch</w:t>
+        <w:t>Book Three  ·  Defend — three tiers, and what they catch</w:t>
       </w:r>
     </w:p>
     <w:p>
@@ -2961,7 +4158,7 @@
         <w:pStyle w:val="ListBullet"/>
       </w:pPr>
       <w:r>
-        <w:t>Tier 1 — seven deterministic invariants over the chain. Arithmetic, no model, 3.5 ms per authorisation. It takes the entire model-independent structural class off the table and goes first because it is free.</w:t>
+        <w:t>Tier 1 — seven deterministic invariants over the chain. Arithmetic, no model, 3.5 ms per authorisation. It takes the entire model-independent structural class off the table, and goes first because it is free.</w:t>
       </w:r>
     </w:p>
     <w:p>
@@ -2982,7 +4179,7 @@
     </w:p>
     <w:p>
       <w:pPr>
-        <w:pStyle w:val="Heading2"/>
+        <w:pStyle w:val="Heading3"/>
       </w:pPr>
       <w:r>
         <w:t>Detection efficacy</w:t>
@@ -2994,10 +4191,11 @@
       </w:r>
     </w:p>
     <w:p>
-      <w:pPr>
-        <w:pStyle w:val="Heading3"/>
-      </w:pPr>
       <w:r>
+        <w:rPr>
+          <w:b/>
+          <w:sz w:val="21"/>
+        </w:rPr>
         <w:t>UPI Autopay</w:t>
       </w:r>
     </w:p>
@@ -3400,10 +4598,11 @@
     </w:tbl>
     <w:p/>
     <w:p>
-      <w:pPr>
-        <w:pStyle w:val="Heading3"/>
-      </w:pPr>
       <w:r>
+        <w:rPr>
+          <w:b/>
+          <w:sz w:val="21"/>
+        </w:rPr>
         <w:t>NPCI UAP</w:t>
       </w:r>
     </w:p>
@@ -3807,7 +5006,7 @@
     <w:p/>
     <w:p>
       <w:pPr>
-        <w:pStyle w:val="Heading2"/>
+        <w:pStyle w:val="Heading3"/>
       </w:pPr>
       <w:r>
         <w:t>Detection is not prevention</w:t>
@@ -3815,6 +5014,9 @@
     </w:p>
     <w:p>
       <w:r>
+        <w:rPr>
+          <w:b/>
+        </w:rPr>
         <w:t>Tier 1 flags every attack in the documented corpus — precision 1.000, recall 1.000, F1 1.000, zero false positives — and ₹3,996.00 still reaches the attacker. S-03 fires three concurrent redemptions at one authorisation; the control refuses two and the third settles. Every one of those episodes is a true positive by decision and a success by ledger.</w:t>
       </w:r>
     </w:p>
@@ -3825,7 +5027,7 @@
     </w:p>
     <w:p>
       <w:pPr>
-        <w:pStyle w:val="Heading2"/>
+        <w:pStyle w:val="Heading3"/>
       </w:pPr>
       <w:r>
         <w:t>What adaptation does</w:t>
@@ -3849,12 +5051,15 @@
     </w:p>
     <w:p>
       <w:r>
+        <w:rPr>
+          <w:b/>
+        </w:rPr>
         <w:t>That gap is the finding. Every comparable tool reports the round-0 number and stops. A control that holds against a documented attack list and folds in one round against an attacker that reads its rejection messages has not been tested.</w:t>
       </w:r>
     </w:p>
     <w:p>
       <w:pPr>
-        <w:pStyle w:val="Heading2"/>
+        <w:pStyle w:val="Heading3"/>
       </w:pPr>
       <w:r>
         <w:t>Where the learned tier stops</w:t>
@@ -3862,15 +5067,15 @@
     </w:p>
     <w:p>
       <w:r>
-        <w:t>Tier 2 catches 52 of 52 in-sample with zero false positives in 72, and 0% against either held-out merchant it was not trained on. AUC on the campaigns it judges is 0.917. That is reported rather than hidden: a learned tier generalises to variants of what it has seen, not to techniques nobody has run yet, which is precisely why Tier 1 goes first and why the headline result does not rest on a model.</w:t>
+        <w:t>Tier 2 catches 52 of 52 in-sample with zero false positives in 72, and 0% against either held-out merchant it was not trained on. AUC on the campaigns it judges is 0.917. That is reported rather than hidden: a learned tier generalises to variants of what it has seen, not to techniques nobody has run yet — which is precisely why Tier 1 goes first, and why the headline result does not rest on a model.</w:t>
       </w:r>
     </w:p>
     <w:p>
       <w:pPr>
-        <w:pStyle w:val="Heading1"/>
+        <w:pStyle w:val="Heading3"/>
       </w:pPr>
       <w:r>
-        <w:t>5. The victim model is a variable, not a constant</w:t>
+        <w:t>The victim model is a variable, not a constant</w:t>
       </w:r>
     </w:p>
     <w:p>
@@ -4067,10 +5272,10 @@
     </w:p>
     <w:p>
       <w:pPr>
-        <w:pStyle w:val="Heading1"/>
+        <w:pStyle w:val="Heading2"/>
       </w:pPr>
       <w:r>
-        <w:t>6. Real-world feasibility in live payments</w:t>
+        <w:t>Book Four  ·  Feasibility — running this in production</w:t>
       </w:r>
     </w:p>
     <w:p>
@@ -4094,7 +5299,7 @@
         <w:pStyle w:val="ListBullet"/>
       </w:pPr>
       <w:r>
-        <w:t>Every block names the rule it enforced with observed and expected values. A control that cannot say why it refused is unusable in a regulated environment, and this is asserted by a test rather than claimed.</w:t>
+        <w:t>Every block names the rule it enforced, with observed and expected values. A control that cannot say why it refused is unusable in a regulated environment, and this is asserted by a test rather than claimed.</w:t>
       </w:r>
     </w:p>
     <w:p>
@@ -4102,7 +5307,7 @@
         <w:pStyle w:val="ListBullet"/>
       </w:pPr>
       <w:r>
-        <w:t>Benign pass rate is 100% across every committed campaign. A control that refuses honest traffic will be switched off in production whatever its recall, so the false-positive rate is printed beside every headline number.</w:t>
+        <w:t>Benign pass rate is 100% across every committed campaign. A control that refuses honest traffic will be switched off in production whatever its recall.</w:t>
       </w:r>
     </w:p>
     <w:p>
@@ -4123,10 +5328,10 @@
     </w:p>
     <w:p>
       <w:pPr>
-        <w:pStyle w:val="Heading2"/>
+        <w:pStyle w:val="Heading3"/>
       </w:pPr>
       <w:r>
-        <w:t>Honest limits</w:t>
+        <w:t>Risks and honest limits</w:t>
       </w:r>
     </w:p>
     <w:p>
@@ -4140,11 +5345,21 @@
       </w:r>
     </w:p>
     <w:p>
+      <w:r>
+        <w:t>The range is a simulation — a high-fidelity one, with real signatures, real decimal arithmetic and a real ledger, but a simulation. A production deployment would meet merchant populations, rail semantics and volumes we have modelled rather than observed. What transfers is the method and the control; the specific rates would have to be re-measured on real traffic, and the harness is built to be pointed at it.</w:t>
+      </w:r>
+    </w:p>
+    <w:p>
+      <w:r>
+        <w:br w:type="page"/>
+      </w:r>
+    </w:p>
+    <w:p>
       <w:pPr>
         <w:pStyle w:val="Heading1"/>
       </w:pPr>
       <w:r>
-        <w:t>7. Reproduce every number in this document</w:t>
+        <w:t>Appendix  ·  Reproduce every number in this report</w:t>
       </w:r>
     </w:p>
     <w:p>
@@ -4158,6 +5373,14 @@
       </w:pPr>
       <w:r>
         <w:t>pip install -e ".[dev]"   —   install</w:t>
+      </w:r>
+    </w:p>
+    <w:p>
+      <w:pPr>
+        <w:pStyle w:val="ListBullet"/>
+      </w:pPr>
+      <w:r>
+        <w:t>python -m praman demo   —   one honest purchase, settled end to end</w:t>
       </w:r>
     </w:p>
     <w:p>
@@ -4217,8 +5440,32 @@
       </w:r>
     </w:p>
     <w:p>
+      <w:pPr>
+        <w:pStyle w:val="ListBullet"/>
+      </w:pPr>
       <w:r>
-        <w:t>A teammate adds a test case by writing one YAML file and running `python -m praman run &lt;file&gt;`; the campaign appears in the arena with no code change and no redeploy.</w:t>
+        <w:t>python -m praman walkthrough   —   rebuild this document from the results</w:t>
+      </w:r>
+    </w:p>
+    <w:p>
+      <w:pPr>
+        <w:spacing w:after="80"/>
+        <w:pBdr>
+          <w:bottom w:val="single" w:sz="4" w:space="1" w:color="5B6675"/>
+        </w:pBdr>
+      </w:pPr>
+    </w:p>
+    <w:p>
+      <w:pPr>
+        <w:jc w:val="center"/>
+      </w:pPr>
+      <w:r>
+        <w:rPr>
+          <w:i/>
+          <w:color w:val="5B6675"/>
+          <w:sz w:val="18"/>
+        </w:rPr>
+        <w:t>Generated by `python -m praman walkthrough`. Every quantity in this report was read from the repository's committed results at build time; a test in the suite fails if it can no longer be.</w:t>
       </w:r>
     </w:p>
     <w:sectPr>
@@ -4594,6 +5841,14 @@
     <w:name w:val="Normal"/>
     <w:qFormat/>
     <w:rsid w:val="00FC693F"/>
+    <w:pPr>
+      <w:spacing w:after="140"/>
+    </w:pPr>
+    <w:rPr>
+      <w:rFonts w:ascii="Calibri" w:hAnsi="Calibri"/>
+      <w:color w:val="111822"/>
+      <w:sz w:val="21"/>
+    </w:rPr>
   </w:style>
   <w:style w:type="paragraph" w:styleId="Header">
     <w:name w:val="header"/>
@@ -4654,11 +5909,11 @@
       <w:outlineLvl w:val="0"/>
     </w:pPr>
     <w:rPr>
-      <w:rFonts w:asciiTheme="majorHAnsi" w:eastAsiaTheme="majorEastAsia" w:hAnsiTheme="majorHAnsi" w:cstheme="majorBidi"/>
+      <w:rFonts w:asciiTheme="majorHAnsi" w:eastAsiaTheme="majorEastAsia" w:hAnsiTheme="majorHAnsi" w:cstheme="majorBidi" w:ascii="Calibri" w:hAnsi="Calibri"/>
       <w:b/>
       <w:bCs/>
-      <w:color w:val="365F91" w:themeColor="accent1" w:themeShade="BF"/>
-      <w:sz w:val="28"/>
+      <w:color w:val="C02B3E"/>
+      <w:sz w:val="32"/>
       <w:szCs w:val="28"/>
     </w:rPr>
   </w:style>
@@ -4678,11 +5933,11 @@
       <w:outlineLvl w:val="1"/>
     </w:pPr>
     <w:rPr>
-      <w:rFonts w:asciiTheme="majorHAnsi" w:eastAsiaTheme="majorEastAsia" w:hAnsiTheme="majorHAnsi" w:cstheme="majorBidi"/>
+      <w:rFonts w:asciiTheme="majorHAnsi" w:eastAsiaTheme="majorEastAsia" w:hAnsiTheme="majorHAnsi" w:cstheme="majorBidi" w:ascii="Calibri" w:hAnsi="Calibri"/>
       <w:b/>
       <w:bCs/>
-      <w:color w:val="4F81BD" w:themeColor="accent1"/>
-      <w:sz w:val="26"/>
+      <w:color w:val="111822"/>
+      <w:sz w:val="25"/>
       <w:szCs w:val="26"/>
     </w:rPr>
   </w:style>
@@ -4702,10 +5957,11 @@
       <w:outlineLvl w:val="2"/>
     </w:pPr>
     <w:rPr>
-      <w:rFonts w:asciiTheme="majorHAnsi" w:eastAsiaTheme="majorEastAsia" w:hAnsiTheme="majorHAnsi" w:cstheme="majorBidi"/>
+      <w:rFonts w:asciiTheme="majorHAnsi" w:eastAsiaTheme="majorEastAsia" w:hAnsiTheme="majorHAnsi" w:cstheme="majorBidi" w:ascii="Calibri" w:hAnsi="Calibri"/>
       <w:b/>
       <w:bCs/>
-      <w:color w:val="4F81BD" w:themeColor="accent1"/>
+      <w:color w:val="111822"/>
+      <w:sz w:val="22"/>
     </w:rPr>
   </w:style>
   <w:style w:type="paragraph" w:styleId="Heading4">

</xml_diff>